<commit_message>
docs: added the new updated project document
</commit_message>
<xml_diff>
--- a/project docs/Cyber_Proj_Shlomi_Levi_rev_2.docx
+++ b/project docs/Cyber_Proj_Shlomi_Levi_rev_2.docx
@@ -1510,7 +1510,7 @@
     </w:p>
     <w:sdt>
       <w:sdtPr>
-        <w:id w:val="1716901036"/>
+        <w:id w:val="-493747344"/>
         <w:docPartObj>
           <w:docPartGallery w:val="Table of Contents"/>
           <w:docPartUnique w:val="1"/>
@@ -5895,7 +5895,7 @@
       <w:bookmarkEnd w:id="4"/>
       <w:sdt>
         <w:sdtPr>
-          <w:id w:val="-1472094598"/>
+          <w:id w:val="1554143622"/>
           <w:tag w:val="goog_rdk_0"/>
         </w:sdtPr>
         <w:sdtContent>
@@ -6395,12 +6395,12 @@
             <wp:extent cx="3381058" cy="3755344"/>
             <wp:effectExtent b="0" l="0" r="0" t="0"/>
             <wp:wrapSquare wrapText="bothSides" distB="114300" distT="114300" distL="114300" distR="114300"/>
-            <wp:docPr id="1" name="image7.png"/>
+            <wp:docPr id="1" name="image1.png"/>
             <a:graphic>
               <a:graphicData uri="http://schemas.openxmlformats.org/drawingml/2006/picture">
                 <pic:pic>
                   <pic:nvPicPr>
-                    <pic:cNvPr id="0" name="image7.png"/>
+                    <pic:cNvPr id="0" name="image1.png"/>
                     <pic:cNvPicPr preferRelativeResize="0"/>
                   </pic:nvPicPr>
                   <pic:blipFill>
@@ -6811,12 +6811,12 @@
           <wp:inline distB="114300" distT="114300" distL="114300" distR="114300">
             <wp:extent cx="4688619" cy="6913581"/>
             <wp:effectExtent b="0" l="0" r="0" t="0"/>
-            <wp:docPr id="4" name="image5.png"/>
+            <wp:docPr id="4" name="image12.png"/>
             <a:graphic>
               <a:graphicData uri="http://schemas.openxmlformats.org/drawingml/2006/picture">
                 <pic:pic>
                   <pic:nvPicPr>
-                    <pic:cNvPr id="0" name="image5.png"/>
+                    <pic:cNvPr id="0" name="image12.png"/>
                     <pic:cNvPicPr preferRelativeResize="0"/>
                   </pic:nvPicPr>
                   <pic:blipFill>
@@ -7107,12 +7107,12 @@
           <wp:inline distB="114300" distT="114300" distL="114300" distR="114300">
             <wp:extent cx="5759140" cy="6070600"/>
             <wp:effectExtent b="0" l="0" r="0" t="0"/>
-            <wp:docPr id="5" name="image6.png"/>
+            <wp:docPr id="5" name="image10.png"/>
             <a:graphic>
               <a:graphicData uri="http://schemas.openxmlformats.org/drawingml/2006/picture">
                 <pic:pic>
                   <pic:nvPicPr>
-                    <pic:cNvPr id="0" name="image6.png"/>
+                    <pic:cNvPr id="0" name="image10.png"/>
                     <pic:cNvPicPr preferRelativeResize="0"/>
                   </pic:nvPicPr>
                   <pic:blipFill>
@@ -7175,12 +7175,12 @@
           <wp:inline distB="114300" distT="114300" distL="114300" distR="114300">
             <wp:extent cx="5610225" cy="6105525"/>
             <wp:effectExtent b="0" l="0" r="0" t="0"/>
-            <wp:docPr id="6" name="image2.png"/>
+            <wp:docPr id="7" name="image11.png"/>
             <a:graphic>
               <a:graphicData uri="http://schemas.openxmlformats.org/drawingml/2006/picture">
                 <pic:pic>
                   <pic:nvPicPr>
-                    <pic:cNvPr id="0" name="image2.png"/>
+                    <pic:cNvPr id="0" name="image11.png"/>
                     <pic:cNvPicPr preferRelativeResize="0"/>
                   </pic:nvPicPr>
                   <pic:blipFill>
@@ -7288,7 +7288,7 @@
           <wp:inline distB="114300" distT="114300" distL="114300" distR="114300">
             <wp:extent cx="4933950" cy="3343275"/>
             <wp:effectExtent b="0" l="0" r="0" t="0"/>
-            <wp:docPr id="2" name="image3.png"/>
+            <wp:docPr id="3" name="image3.png"/>
             <a:graphic>
               <a:graphicData uri="http://schemas.openxmlformats.org/drawingml/2006/picture">
                 <pic:pic>
@@ -8101,12 +8101,12 @@
           <wp:inline distB="114300" distT="114300" distL="114300" distR="114300">
             <wp:extent cx="5438775" cy="2905125"/>
             <wp:effectExtent b="0" l="0" r="0" t="0"/>
-            <wp:docPr id="7" name="image11.png"/>
+            <wp:docPr id="11" name="image2.png"/>
             <a:graphic>
               <a:graphicData uri="http://schemas.openxmlformats.org/drawingml/2006/picture">
                 <pic:pic>
                   <pic:nvPicPr>
-                    <pic:cNvPr id="0" name="image11.png"/>
+                    <pic:cNvPr id="0" name="image2.png"/>
                     <pic:cNvPicPr preferRelativeResize="0"/>
                   </pic:nvPicPr>
                   <pic:blipFill>
@@ -8337,22 +8337,28 @@
         <w:rPr/>
       </w:pPr>
       <w:r>
+        <w:rPr>
+          <w:rtl w:val="0"/>
+        </w:rPr>
+        <w:t xml:space="preserve">Login and register page:</w:t>
+      </w:r>
+      <w:r>
         <w:rPr/>
         <w:drawing>
           <wp:inline distB="114300" distT="114300" distL="114300" distR="114300">
-            <wp:extent cx="3962083" cy="2920408"/>
+            <wp:extent cx="5759140" cy="2857500"/>
             <wp:effectExtent b="0" l="0" r="0" t="0"/>
-            <wp:docPr id="11" name="image9.png"/>
+            <wp:docPr id="8" name="image6.png"/>
             <a:graphic>
               <a:graphicData uri="http://schemas.openxmlformats.org/drawingml/2006/picture">
                 <pic:pic>
                   <pic:nvPicPr>
-                    <pic:cNvPr id="0" name="image9.png"/>
+                    <pic:cNvPr id="0" name="image6.png"/>
                     <pic:cNvPicPr preferRelativeResize="0"/>
                   </pic:nvPicPr>
                   <pic:blipFill>
                     <a:blip r:embed="rId16"/>
-                    <a:srcRect b="32413" l="21884" r="22391" t="0"/>
+                    <a:srcRect b="0" l="0" r="0" t="0"/>
                     <a:stretch>
                       <a:fillRect/>
                     </a:stretch>
@@ -8360,7 +8366,7 @@
                   <pic:spPr>
                     <a:xfrm>
                       <a:off x="0" y="0"/>
-                      <a:ext cx="3962083" cy="2920408"/>
+                      <a:ext cx="5759140" cy="2857500"/>
                     </a:xfrm>
                     <a:prstGeom prst="rect"/>
                     <a:ln/>
@@ -8383,12 +8389,24 @@
         <w:rPr/>
       </w:pPr>
       <w:r>
+        <w:rPr>
+          <w:rtl w:val="0"/>
+        </w:rPr>
+        <w:t xml:space="preserve">Clients page: manage controllers</w:t>
+      </w:r>
+    </w:p>
+    <w:p>
+      <w:pPr>
+        <w:ind w:left="0" w:firstLine="0"/>
+        <w:rPr/>
+      </w:pPr>
+      <w:r>
         <w:rPr/>
         <w:drawing>
           <wp:inline distB="114300" distT="114300" distL="114300" distR="114300">
-            <wp:extent cx="5447983" cy="1638300"/>
+            <wp:extent cx="5762625" cy="1713880"/>
             <wp:effectExtent b="0" l="0" r="0" t="0"/>
-            <wp:docPr id="10" name="image4.png"/>
+            <wp:docPr id="9" name="image4.png"/>
             <a:graphic>
               <a:graphicData uri="http://schemas.openxmlformats.org/drawingml/2006/picture">
                 <pic:pic>
@@ -8398,7 +8416,7 @@
                   </pic:nvPicPr>
                   <pic:blipFill>
                     <a:blip r:embed="rId17"/>
-                    <a:srcRect b="52285" l="0" r="0" t="0"/>
+                    <a:srcRect b="40022" l="0" r="0" t="0"/>
                     <a:stretch>
                       <a:fillRect/>
                     </a:stretch>
@@ -8406,7 +8424,7 @@
                   <pic:spPr>
                     <a:xfrm>
                       <a:off x="0" y="0"/>
-                      <a:ext cx="5447983" cy="1638300"/>
+                      <a:ext cx="5762625" cy="1713880"/>
                     </a:xfrm>
                     <a:prstGeom prst="rect"/>
                     <a:ln/>
@@ -8421,25 +8439,26 @@
         <w:rPr>
           <w:rtl w:val="0"/>
         </w:rPr>
+        <w:t xml:space="preserve">Users page: see users registered in the database</w:t>
       </w:r>
     </w:p>
     <w:p>
       <w:pPr>
-        <w:ind w:left="0"/>
+        <w:ind w:left="0" w:firstLine="0"/>
         <w:rPr/>
       </w:pPr>
       <w:r>
         <w:rPr/>
         <w:drawing>
           <wp:inline distB="114300" distT="114300" distL="114300" distR="114300">
-            <wp:extent cx="5462836" cy="3580954"/>
+            <wp:extent cx="5759140" cy="2857500"/>
             <wp:effectExtent b="0" l="0" r="0" t="0"/>
-            <wp:docPr id="3" name="image8.png"/>
+            <wp:docPr id="2" name="image5.png"/>
             <a:graphic>
               <a:graphicData uri="http://schemas.openxmlformats.org/drawingml/2006/picture">
                 <pic:pic>
                   <pic:nvPicPr>
-                    <pic:cNvPr id="0" name="image8.png"/>
+                    <pic:cNvPr id="0" name="image5.png"/>
                     <pic:cNvPicPr preferRelativeResize="0"/>
                   </pic:nvPicPr>
                   <pic:blipFill>
@@ -8452,7 +8471,7 @@
                   <pic:spPr>
                     <a:xfrm>
                       <a:off x="0" y="0"/>
-                      <a:ext cx="5462836" cy="3580954"/>
+                      <a:ext cx="5759140" cy="2857500"/>
                     </a:xfrm>
                     <a:prstGeom prst="rect"/>
                     <a:ln/>
@@ -8471,51 +8490,33 @@
     </w:p>
     <w:p>
       <w:pPr>
-        <w:pStyle w:val="Heading3"/>
-        <w:ind w:left="0" w:firstLine="0"/>
-        <w:jc w:val="both"/>
+        <w:ind w:left="0"/>
         <w:rPr/>
       </w:pPr>
-      <w:bookmarkStart w:colFirst="0" w:colLast="0" w:name="_heading=h.e80m914430p3" w:id="29"/>
-      <w:bookmarkEnd w:id="29"/>
-      <w:r>
-        <w:rPr>
-          <w:rtl w:val="0"/>
-        </w:rPr>
-        <w:t xml:space="preserve">1.6.1</w:t>
-        <w:tab/>
-        <w:t xml:space="preserve">Forms workflow</w:t>
+      <w:r>
+        <w:rPr>
+          <w:rtl w:val="0"/>
+        </w:rPr>
+        <w:t xml:space="preserve">Dashboard page: create/edit buttons that translate to commands for a controller(first to be selected from all of the user’s controllers in the database) to execute by deciding which electrical pins will get voltage when clicked</w:t>
       </w:r>
     </w:p>
     <w:p>
       <w:pPr>
-        <w:ind w:firstLine="284"/>
-        <w:rPr/>
-      </w:pPr>
-      <w:r>
-        <w:rPr>
-          <w:rtl w:val="0"/>
-        </w:rPr>
-        <w:t xml:space="preserve">…</w:t>
-      </w:r>
-    </w:p>
-    <w:p>
-      <w:pPr>
-        <w:ind w:firstLine="284"/>
+        <w:ind w:left="0"/>
         <w:rPr/>
       </w:pPr>
       <w:r>
         <w:rPr/>
         <w:drawing>
-          <wp:inline distB="0" distT="0" distL="114300" distR="114300">
-            <wp:extent cx="4391025" cy="3169285"/>
+          <wp:inline distB="114300" distT="114300" distL="114300" distR="114300">
+            <wp:extent cx="5759140" cy="2857500"/>
             <wp:effectExtent b="0" l="0" r="0" t="0"/>
-            <wp:docPr id="9" name="image1.png"/>
+            <wp:docPr id="6" name="image7.png"/>
             <a:graphic>
               <a:graphicData uri="http://schemas.openxmlformats.org/drawingml/2006/picture">
                 <pic:pic>
                   <pic:nvPicPr>
-                    <pic:cNvPr id="0" name="image1.png"/>
+                    <pic:cNvPr id="0" name="image7.png"/>
                     <pic:cNvPicPr preferRelativeResize="0"/>
                   </pic:nvPicPr>
                   <pic:blipFill>
@@ -8528,7 +8529,7 @@
                   <pic:spPr>
                     <a:xfrm>
                       <a:off x="0" y="0"/>
-                      <a:ext cx="4391025" cy="3169285"/>
+                      <a:ext cx="5759140" cy="2857500"/>
                     </a:xfrm>
                     <a:prstGeom prst="rect"/>
                     <a:ln/>
@@ -8543,7 +8544,17 @@
         <w:rPr>
           <w:rtl w:val="0"/>
         </w:rPr>
-        <w:t xml:space="preserve">…</w:t>
+      </w:r>
+    </w:p>
+    <w:p>
+      <w:pPr>
+        <w:ind w:left="0"/>
+        <w:rPr/>
+      </w:pPr>
+      <w:r>
+        <w:rPr>
+          <w:rtl w:val="0"/>
+        </w:rPr>
       </w:r>
     </w:p>
     <w:p>
@@ -8553,6 +8564,70 @@
         <w:jc w:val="both"/>
         <w:rPr/>
       </w:pPr>
+      <w:bookmarkStart w:colFirst="0" w:colLast="0" w:name="_heading=h.e80m914430p3" w:id="29"/>
+      <w:bookmarkEnd w:id="29"/>
+      <w:r>
+        <w:rPr>
+          <w:rtl w:val="0"/>
+        </w:rPr>
+        <w:t xml:space="preserve">1.6.1</w:t>
+        <w:tab/>
+        <w:t xml:space="preserve">Forms workflow</w:t>
+      </w:r>
+    </w:p>
+    <w:p>
+      <w:pPr>
+        <w:ind w:hanging="1275.5905511811022"/>
+        <w:rPr/>
+      </w:pPr>
+      <w:r>
+        <w:rPr/>
+        <w:drawing>
+          <wp:inline distB="114300" distT="114300" distL="114300" distR="114300">
+            <wp:extent cx="7391083" cy="8111866"/>
+            <wp:effectExtent b="0" l="0" r="0" t="0"/>
+            <wp:docPr id="10" name="image9.png"/>
+            <a:graphic>
+              <a:graphicData uri="http://schemas.openxmlformats.org/drawingml/2006/picture">
+                <pic:pic>
+                  <pic:nvPicPr>
+                    <pic:cNvPr id="0" name="image9.png"/>
+                    <pic:cNvPicPr preferRelativeResize="0"/>
+                  </pic:nvPicPr>
+                  <pic:blipFill>
+                    <a:blip r:embed="rId20"/>
+                    <a:srcRect b="0" l="0" r="0" t="0"/>
+                    <a:stretch>
+                      <a:fillRect/>
+                    </a:stretch>
+                  </pic:blipFill>
+                  <pic:spPr>
+                    <a:xfrm>
+                      <a:off x="0" y="0"/>
+                      <a:ext cx="7391083" cy="8111866"/>
+                    </a:xfrm>
+                    <a:prstGeom prst="rect"/>
+                    <a:ln/>
+                  </pic:spPr>
+                </pic:pic>
+              </a:graphicData>
+            </a:graphic>
+          </wp:inline>
+        </w:drawing>
+      </w:r>
+      <w:r>
+        <w:rPr>
+          <w:rtl w:val="0"/>
+        </w:rPr>
+      </w:r>
+    </w:p>
+    <w:p>
+      <w:pPr>
+        <w:pStyle w:val="Heading3"/>
+        <w:ind w:left="0" w:firstLine="0"/>
+        <w:jc w:val="both"/>
+        <w:rPr/>
+      </w:pPr>
       <w:bookmarkStart w:colFirst="0" w:colLast="0" w:name="_heading=h.5zgvhfi13ao3" w:id="30"/>
       <w:bookmarkEnd w:id="30"/>
       <w:r>
@@ -8750,7 +8825,7 @@
         </w:rPr>
         <w:t xml:space="preserve">Then upload the code(by running </w:t>
       </w:r>
-      <w:hyperlink r:id="rId20">
+      <w:hyperlink r:id="rId21">
         <w:r>
           <w:rPr>
             <w:color w:val="1155cc"/>
@@ -15244,7 +15319,7 @@
         </w:rPr>
         <w:t xml:space="preserve">TinyGSM - </w:t>
       </w:r>
-      <w:hyperlink r:id="rId21">
+      <w:hyperlink r:id="rId22">
         <w:r>
           <w:rPr>
             <w:color w:val="1155cc"/>
@@ -15344,9 +15419,9 @@
       </w:r>
     </w:p>
     <w:sectPr>
-      <w:headerReference r:id="rId22" w:type="default"/>
-      <w:headerReference r:id="rId23" w:type="first"/>
-      <w:footerReference r:id="rId24" w:type="default"/>
+      <w:headerReference r:id="rId23" w:type="default"/>
+      <w:headerReference r:id="rId24" w:type="first"/>
+      <w:footerReference r:id="rId25" w:type="default"/>
       <w:pgSz w:h="16840" w:w="11907" w:orient="portrait"/>
       <w:pgMar w:bottom="879" w:top="1440" w:left="1418" w:right="1418" w:header="720" w:footer="754"/>
       <w:pgNumType w:start="1"/>
@@ -15532,12 +15607,12 @@
         <wp:inline distB="0" distT="0" distL="114300" distR="114300">
           <wp:extent cx="5757545" cy="1431925"/>
           <wp:effectExtent b="0" l="0" r="0" t="0"/>
-          <wp:docPr id="8" name="image10.png"/>
+          <wp:docPr id="12" name="image8.png"/>
           <a:graphic>
             <a:graphicData uri="http://schemas.openxmlformats.org/drawingml/2006/picture">
               <pic:pic>
                 <pic:nvPicPr>
-                  <pic:cNvPr id="0" name="image10.png"/>
+                  <pic:cNvPr id="0" name="image8.png"/>
                   <pic:cNvPicPr preferRelativeResize="0"/>
                 </pic:nvPicPr>
                 <pic:blipFill>

</xml_diff>